<commit_message>
chore: finalize assessment documentation and version
</commit_message>
<xml_diff>
--- a/docs/Exploratory Testing & Quality Assessment Report.docx
+++ b/docs/Exploratory Testing & Quality Assessment Report.docx
@@ -1,6 +1,6 @@
 
 <file path=word/document.xml><?xml version="1.0" encoding="utf-8"?>
-<w:document xmlns:wpc="http://schemas.microsoft.com/office/word/2010/wordprocessingCanvas" xmlns:mo="http://schemas.microsoft.com/office/mac/office/2008/main" xmlns:mc="http://schemas.openxmlformats.org/markup-compatibility/2006" xmlns:mv="urn:schemas-microsoft-com:mac:vml" xmlns:o="urn:schemas-microsoft-com:office:office" xmlns:r="http://schemas.openxmlformats.org/officeDocument/2006/relationships" xmlns:m="http://schemas.openxmlformats.org/officeDocument/2006/math" xmlns:v="urn:schemas-microsoft-com:vml" xmlns:wp14="http://schemas.microsoft.com/office/word/2010/wordprocessingDrawing" xmlns:wp="http://schemas.openxmlformats.org/drawingml/2006/wordprocessingDrawing" xmlns:w10="urn:schemas-microsoft-com:office:word" xmlns:w="http://schemas.openxmlformats.org/wordprocessingml/2006/main" xmlns:w14="http://schemas.microsoft.com/office/word/2010/wordml" xmlns:wpg="http://schemas.microsoft.com/office/word/2010/wordprocessingGroup" xmlns:wpi="http://schemas.microsoft.com/office/word/2010/wordprocessingInk" xmlns:wne="http://schemas.microsoft.com/office/word/2006/wordml" xmlns:wps="http://schemas.microsoft.com/office/word/2010/wordprocessingShape" xmlns:a="http://schemas.openxmlformats.org/drawingml/2006/main" xmlns:pic="http://schemas.openxmlformats.org/drawingml/2006/picture" mc:Ignorable="w14 wp14">
+<w:document xmlns:wpc="http://schemas.microsoft.com/office/word/2010/wordprocessingCanvas" xmlns:mo="http://schemas.microsoft.com/office/mac/office/2008/main" xmlns:mc="http://schemas.openxmlformats.org/markup-compatibility/2006" xmlns:mv="urn:schemas-microsoft-com:mac:vml" xmlns:o="urn:schemas-microsoft-com:office:office" xmlns:r="http://schemas.openxmlformats.org/officeDocument/2006/relationships" xmlns:m="http://schemas.openxmlformats.org/officeDocument/2006/math" xmlns:v="urn:schemas-microsoft-com:vml" xmlns:wp14="http://schemas.microsoft.com/office/word/2010/wordprocessingDrawing" xmlns:wp="http://schemas.openxmlformats.org/drawingml/2006/wordprocessingDrawing" xmlns:w10="urn:schemas-microsoft-com:office:word" xmlns:w="http://schemas.openxmlformats.org/wordprocessingml/2006/main" xmlns:w14="http://schemas.microsoft.com/office/word/2010/wordml" xmlns:wpg="http://schemas.microsoft.com/office/word/2010/wordprocessingGroup" xmlns:wpi="http://schemas.microsoft.com/office/word/2010/wordprocessingInk" xmlns:wne="http://schemas.microsoft.com/office/word/2006/wordml" xmlns:wps="http://schemas.microsoft.com/office/word/2010/wordprocessingShape" xmlns:a="http://schemas.openxmlformats.org/drawingml/2006/main" xmlns:pic="http://schemas.openxmlformats.org/drawingml/2006/picture" xmlns:a14="http://schemas.microsoft.com/office/drawing/2010/main" mc:Ignorable="w14 wp14">
   <w:body>
     <w:p xmlns:wp14="http://schemas.microsoft.com/office/word/2010/wordml" wp14:textId="77777777">
       <w:pPr>
@@ -16,36 +16,23 @@
         <w:t>GLOBALSQA BANKING PROJECT</w:t>
       </w:r>
     </w:p>
-    <w:p xmlns:wp14="http://schemas.microsoft.com/office/word/2010/wordml" wp14:textId="77777777">
-      <w:pPr>
+    <w:p xmlns:wp14="http://schemas.microsoft.com/office/word/2010/wordml" wp14:textId="11AF7D8E">
+      <w:pPr>
+        <w:pStyle w:val="Normal"/>
         <w:spacing w:after="140"/>
       </w:pPr>
       <w:r>
         <w:rPr>
-          <w:rFonts w:ascii="Aptos" w:hAnsi="Aptos"/>
-          <w:b/>
-          <w:color w:val="17365D"/>
+          <w:rFonts w:ascii="Aptos" w:hAnsi="Aptos" w:eastAsia="ＭＳ 明朝" w:cs="" w:asciiTheme="minorAscii" w:hAnsiTheme="minorAscii" w:eastAsiaTheme="minorEastAsia" w:cstheme="minorBidi"/>
+          <w:b w:val="1"/>
+          <w:bCs w:val="1"/>
+          <w:noProof w:val="0"/>
+          <w:color w:val="17365D" w:themeColor="text2" w:themeTint="FF" w:themeShade="BF"/>
           <w:sz w:val="58"/>
-        </w:rPr>
-        <w:t>Exploratory Testing</w:t>
-      </w:r>
-      <w:r>
-        <w:rPr>
-          <w:rFonts w:ascii="Aptos" w:hAnsi="Aptos"/>
-          <w:b/>
-          <w:color w:val="17365D"/>
-          <w:sz w:val="58"/>
-        </w:rPr>
-        <w:br/>
-      </w:r>
-      <w:r>
-        <w:rPr>
-          <w:rFonts w:ascii="Aptos" w:hAnsi="Aptos"/>
-          <w:b/>
-          <w:color w:val="17365D"/>
-          <w:sz w:val="58"/>
-        </w:rPr>
-        <w:t>Defect Report</w:t>
+          <w:szCs w:val="58"/>
+          <w:lang w:val="en-US" w:eastAsia="en-US" w:bidi="ar-SA"/>
+        </w:rPr>
+        <w:t>Exploratory Testing &amp; Quality Assessment Report</w:t>
       </w:r>
     </w:p>
     <w:p xmlns:wp14="http://schemas.microsoft.com/office/word/2010/wordml" wp14:textId="77777777">
@@ -81,7 +68,7 @@
         <w:tc>
           <w:tcPr>
             <w:tcW w:w="2232" w:type="dxa"/>
-            <w:shd w:fill="17365D"/>
+            <w:shd w:val="clear" w:color="auto" w:fill="17365D" w:themeFill="text2" w:themeFillShade="BF"/>
             <w:tcMar>
               <w:top w:w="120" w:type="dxa"/>
               <w:start w:w="100" w:type="dxa"/>
@@ -108,7 +95,7 @@
         <w:tc>
           <w:tcPr>
             <w:tcW w:w="2232" w:type="dxa"/>
-            <w:shd w:fill="17365D"/>
+            <w:shd w:val="clear" w:color="auto" w:fill="17365D" w:themeFill="text2" w:themeFillShade="BF"/>
             <w:tcMar>
               <w:top w:w="120" w:type="dxa"/>
               <w:start w:w="100" w:type="dxa"/>
@@ -117,25 +104,46 @@
             </w:tcMar>
             <w:vAlign w:val="center"/>
           </w:tcPr>
-          <w:p wp14:textId="77777777">
+          <w:p wp14:textId="2F1E5200">
             <w:pPr>
               <w:jc w:val="center"/>
+              <w:rPr>
+                <w:rFonts w:ascii="Aptos" w:hAnsi="Aptos"/>
+                <w:b w:val="1"/>
+                <w:bCs w:val="1"/>
+                <w:color w:val="FFFFFF" w:themeColor="background1" w:themeTint="FF" w:themeShade="FF"/>
+                <w:sz w:val="32"/>
+                <w:szCs w:val="32"/>
+              </w:rPr>
             </w:pPr>
             <w:r>
               <w:rPr>
                 <w:rFonts w:ascii="Aptos" w:hAnsi="Aptos"/>
-                <w:b/>
-                <w:color w:val="FFFFFF"/>
+                <w:b w:val="1"/>
+                <w:bCs w:val="1"/>
+                <w:color w:val="FFFFFF" w:themeColor="background1" w:themeTint="FF" w:themeShade="FF"/>
                 <w:sz w:val="32"/>
+                <w:szCs w:val="32"/>
               </w:rPr>
-              <w:t>15</w:t>
+              <w:t>1</w:t>
+            </w:r>
+            <w:r>
+              <w:rPr>
+                <w:rFonts w:ascii="Aptos" w:hAnsi="Aptos"/>
+                <w:b w:val="1"/>
+                <w:bCs w:val="1"/>
+                <w:color w:val="FFFFFF" w:themeColor="background1" w:themeTint="FF" w:themeShade="FF"/>
+                <w:sz w:val="32"/>
+                <w:szCs w:val="32"/>
+              </w:rPr>
+              <w:t>5</w:t>
             </w:r>
           </w:p>
         </w:tc>
         <w:tc>
           <w:tcPr>
             <w:tcW w:w="2232" w:type="dxa"/>
-            <w:shd w:fill="17365D"/>
+            <w:shd w:val="clear" w:color="auto" w:fill="17365D" w:themeFill="text2" w:themeFillShade="BF"/>
             <w:tcMar>
               <w:top w:w="120" w:type="dxa"/>
               <w:start w:w="100" w:type="dxa"/>
@@ -162,7 +170,7 @@
         <w:tc>
           <w:tcPr>
             <w:tcW w:w="2664" w:type="dxa"/>
-            <w:shd w:fill="17365D"/>
+            <w:shd w:val="clear" w:color="auto" w:fill="17365D" w:themeFill="text2" w:themeFillShade="BF"/>
             <w:tcMar>
               <w:top w:w="120" w:type="dxa"/>
               <w:start w:w="100" w:type="dxa"/>
@@ -191,7 +199,7 @@
         <w:tc>
           <w:tcPr>
             <w:tcW w:w="2232" w:type="dxa"/>
-            <w:shd w:fill="EDF4FA"/>
+            <w:shd w:val="clear" w:color="auto" w:fill="EDF4FA"/>
             <w:tcMar>
               <w:top w:w="120" w:type="dxa"/>
               <w:start w:w="100" w:type="dxa"/>
@@ -218,7 +226,7 @@
         <w:tc>
           <w:tcPr>
             <w:tcW w:w="2232" w:type="dxa"/>
-            <w:shd w:fill="EDF4FA"/>
+            <w:shd w:val="clear" w:color="auto" w:fill="EDF4FA"/>
             <w:tcMar>
               <w:top w:w="120" w:type="dxa"/>
               <w:start w:w="100" w:type="dxa"/>
@@ -245,7 +253,7 @@
         <w:tc>
           <w:tcPr>
             <w:tcW w:w="2232" w:type="dxa"/>
-            <w:shd w:fill="EDF4FA"/>
+            <w:shd w:val="clear" w:color="auto" w:fill="EDF4FA"/>
             <w:tcMar>
               <w:top w:w="120" w:type="dxa"/>
               <w:start w:w="100" w:type="dxa"/>
@@ -272,7 +280,7 @@
         <w:tc>
           <w:tcPr>
             <w:tcW w:w="2664" w:type="dxa"/>
-            <w:shd w:fill="EDF4FA"/>
+            <w:shd w:val="clear" w:color="auto" w:fill="EDF4FA"/>
             <w:tcMar>
               <w:top w:w="120" w:type="dxa"/>
               <w:start w:w="100" w:type="dxa"/>
@@ -4137,7 +4145,7 @@
         <w:tc>
           <w:tcPr>
             <w:tcW w:w="4968" w:type="dxa"/>
-            <w:shd w:val="clear" w:color="auto" w:fill="C65911"/>
+            <w:shd w:val="clear" w:color="auto" w:fill="4F81BD" w:themeFill="accent1"/>
             <w:tcMar>
               <w:top w:w="95" w:type="dxa"/>
               <w:start w:w="120" w:type="dxa"/>
@@ -4146,7 +4154,15 @@
             </w:tcMar>
             <w:vAlign w:val="center"/>
           </w:tcPr>
-          <w:p wp14:textId="3590AC85">
+          <w:p wp14:textId="3334805C">
+            <w:pPr>
+              <w:pStyle w:val="Normal"/>
+              <w:suppressLineNumbers w:val="0"/>
+              <w:bidi w:val="0"/>
+              <w:spacing w:before="0" w:beforeAutospacing="off" w:after="200" w:afterAutospacing="off" w:line="276" w:lineRule="auto"/>
+              <w:ind w:left="0" w:right="0"/>
+              <w:jc w:val="left"/>
+            </w:pPr>
             <w:r>
               <w:rPr>
                 <w:rFonts w:ascii="Aptos" w:hAnsi="Aptos"/>
@@ -4156,7 +4172,18 @@
                 <w:sz w:val="17"/>
                 <w:szCs w:val="17"/>
               </w:rPr>
-              <w:t>SEVERITY HIGH</w:t>
+              <w:t xml:space="preserve">SEVERITY </w:t>
+            </w:r>
+            <w:r>
+              <w:rPr>
+                <w:rFonts w:ascii="Aptos" w:hAnsi="Aptos"/>
+                <w:b w:val="1"/>
+                <w:bCs w:val="1"/>
+                <w:color w:val="FFFFFF" w:themeColor="background1" w:themeTint="FF" w:themeShade="FF"/>
+                <w:sz w:val="17"/>
+                <w:szCs w:val="17"/>
+              </w:rPr>
+              <w:t>MEDIUM</w:t>
             </w:r>
           </w:p>
         </w:tc>
@@ -4777,17 +4804,27 @@
         <w:t>The Post Code field accepts alphabetic input without applying a defined postal-code format rule. The application should validate the field against the supported country or business format.</w:t>
       </w:r>
     </w:p>
-    <w:p xmlns:wp14="http://schemas.microsoft.com/office/word/2010/wordml" wp14:textId="77777777">
+    <w:p>
       <w:pPr>
         <w:keepNext w:val="0"/>
         <w:spacing w:after="80" w:line="259" w:lineRule="auto"/>
-      </w:pPr>
-      <w:r>
-        <w:rPr>
-          <w:rFonts w:ascii="Aptos" w:hAnsi="Aptos"/>
-          <w:b/>
+        <w:rPr>
+          <w:rFonts w:ascii="Aptos" w:hAnsi="Aptos"/>
+          <w:b w:val="1"/>
+          <w:bCs w:val="1"/>
           <w:color w:val="C65911"/>
           <w:sz w:val="20"/>
+          <w:szCs w:val="20"/>
+        </w:rPr>
+      </w:pPr>
+      <w:r>
+        <w:rPr>
+          <w:rFonts w:ascii="Aptos" w:hAnsi="Aptos"/>
+          <w:b w:val="1"/>
+          <w:bCs w:val="1"/>
+          <w:color w:val="C65911"/>
+          <w:sz w:val="20"/>
+          <w:szCs w:val="20"/>
         </w:rPr>
         <w:t xml:space="preserve">Business impact: </w:t>
       </w:r>
@@ -4795,10 +4832,64 @@
         <w:rPr>
           <w:rFonts w:ascii="Aptos" w:hAnsi="Aptos"/>
           <w:b w:val="0"/>
+          <w:bCs w:val="0"/>
           <w:color w:val="1F1F1F"/>
           <w:sz w:val="20"/>
-        </w:rPr>
-        <w:t>If the supported postal-code format excludes unrestricted alphabetic values, invalid address data may affect onboarding, correspondence, and downstream validation.</w:t>
+          <w:szCs w:val="20"/>
+        </w:rPr>
+        <w:t xml:space="preserve">If the supported postal-code format excludes unrestricted alphabetic values, invalid address data may affect onboarding, correspondence, and downstream </w:t>
+      </w:r>
+      <w:r>
+        <w:rPr>
+          <w:rFonts w:ascii="Aptos" w:hAnsi="Aptos"/>
+          <w:b w:val="0"/>
+          <w:bCs w:val="0"/>
+          <w:color w:val="1F1F1F"/>
+          <w:sz w:val="20"/>
+          <w:szCs w:val="20"/>
+        </w:rPr>
+        <w:t>validation.</w:t>
+      </w:r>
+      <w:r>
+        <w:rPr>
+          <w:rFonts w:ascii="Aptos" w:hAnsi="Aptos"/>
+          <w:b w:val="0"/>
+          <w:bCs w:val="0"/>
+          <w:color w:val="1F1F1F"/>
+          <w:sz w:val="20"/>
+          <w:szCs w:val="20"/>
+        </w:rPr>
+        <w:t xml:space="preserve"> </w:t>
+      </w:r>
+      <w:r>
+        <w:rPr>
+          <w:rFonts w:ascii="Aptos" w:hAnsi="Aptos" w:eastAsia="ＭＳ 明朝" w:cs="" w:asciiTheme="minorAscii" w:hAnsiTheme="minorAscii" w:eastAsiaTheme="minorEastAsia" w:cstheme="minorBidi"/>
+          <w:b w:val="1"/>
+          <w:bCs w:val="1"/>
+          <w:i w:val="1"/>
+          <w:iCs w:val="1"/>
+          <w:color w:val="C65911"/>
+          <w:sz w:val="20"/>
+          <w:szCs w:val="20"/>
+          <w:u w:val="single"/>
+          <w:lang w:eastAsia="en-US" w:bidi="ar-SA"/>
+        </w:rPr>
+        <w:t>Business</w:t>
+      </w:r>
+      <w:r>
+        <w:rPr>
+          <w:rFonts w:ascii="Aptos" w:hAnsi="Aptos" w:eastAsia="ＭＳ 明朝" w:cs="" w:asciiTheme="minorAscii" w:hAnsiTheme="minorAscii" w:eastAsiaTheme="minorEastAsia" w:cstheme="minorBidi"/>
+          <w:b w:val="1"/>
+          <w:bCs w:val="1"/>
+          <w:i w:val="1"/>
+          <w:iCs w:val="1"/>
+          <w:color w:val="C65911"/>
+          <w:sz w:val="20"/>
+          <w:szCs w:val="20"/>
+          <w:u w:val="single"/>
+          <w:lang w:eastAsia="en-US" w:bidi="ar-SA"/>
+        </w:rPr>
+        <w:t xml:space="preserve"> rules pending</w:t>
       </w:r>
     </w:p>
     <w:p xmlns:wp14="http://schemas.microsoft.com/office/word/2010/wordml" wp14:textId="77777777">
@@ -7347,17 +7438,28 @@
         <w:t xml:space="preserve"> warning or an explicit business-rule check.</w:t>
       </w:r>
     </w:p>
-    <w:p xmlns:wp14="http://schemas.microsoft.com/office/word/2010/wordml" wp14:textId="77777777">
-      <w:pPr>
+    <w:p xmlns:wp14="http://schemas.microsoft.com/office/word/2010/wordml" wp14:textId="7B2C9B41">
+      <w:pPr>
+        <w:pStyle w:val="Normal"/>
         <w:keepNext w:val="0"/>
         <w:spacing w:after="80" w:line="259" w:lineRule="auto"/>
-      </w:pPr>
-      <w:r>
-        <w:rPr>
-          <w:rFonts w:ascii="Aptos" w:hAnsi="Aptos"/>
-          <w:b/>
+        <w:rPr>
+          <w:rFonts w:ascii="Aptos" w:hAnsi="Aptos"/>
+          <w:b w:val="1"/>
+          <w:bCs w:val="1"/>
           <w:color w:val="C65911"/>
           <w:sz w:val="20"/>
+          <w:szCs w:val="20"/>
+        </w:rPr>
+      </w:pPr>
+      <w:r>
+        <w:rPr>
+          <w:rFonts w:ascii="Aptos" w:hAnsi="Aptos"/>
+          <w:b w:val="1"/>
+          <w:bCs w:val="1"/>
+          <w:color w:val="C65911"/>
+          <w:sz w:val="20"/>
+          <w:szCs w:val="20"/>
         </w:rPr>
         <w:t xml:space="preserve">Business impact: </w:t>
       </w:r>
@@ -7365,10 +7467,38 @@
         <w:rPr>
           <w:rFonts w:ascii="Aptos" w:hAnsi="Aptos"/>
           <w:b w:val="0"/>
+          <w:bCs w:val="0"/>
           <w:color w:val="1F1F1F"/>
           <w:sz w:val="20"/>
+          <w:szCs w:val="20"/>
         </w:rPr>
         <w:t>If one active account per customer and currency is the intended rule, duplicates can confuse balances, reconciliation, statements, and account servicing.</w:t>
+      </w:r>
+      <w:r>
+        <w:rPr>
+          <w:rFonts w:ascii="Aptos" w:hAnsi="Aptos"/>
+          <w:b w:val="0"/>
+          <w:bCs w:val="0"/>
+          <w:color w:val="1F1F1F"/>
+          <w:sz w:val="20"/>
+          <w:szCs w:val="20"/>
+        </w:rPr>
+        <w:t xml:space="preserve"> </w:t>
+      </w:r>
+      <w:r>
+        <w:rPr>
+          <w:rFonts w:ascii="Aptos" w:hAnsi="Aptos" w:eastAsia="ＭＳ 明朝" w:cs="" w:asciiTheme="minorAscii" w:hAnsiTheme="minorAscii" w:eastAsiaTheme="minorEastAsia" w:cstheme="minorBidi"/>
+          <w:b w:val="1"/>
+          <w:bCs w:val="1"/>
+          <w:i w:val="1"/>
+          <w:iCs w:val="1"/>
+          <w:color w:val="C65911"/>
+          <w:sz w:val="20"/>
+          <w:szCs w:val="20"/>
+          <w:u w:val="single"/>
+          <w:lang w:eastAsia="en-US" w:bidi="ar-SA"/>
+        </w:rPr>
+        <w:t>Business rules pending</w:t>
       </w:r>
     </w:p>
     <w:p xmlns:wp14="http://schemas.microsoft.com/office/word/2010/wordml" wp14:textId="77777777">
@@ -7860,17 +7990,19 @@
         <w:spacing w:after="0"/>
       </w:pPr>
     </w:p>
-    <w:p xmlns:wp14="http://schemas.microsoft.com/office/word/2010/wordml" wp14:textId="77777777">
-      <w:pPr>
-        <w:keepNext/>
+    <w:p xmlns:wp14="http://schemas.microsoft.com/office/word/2010/wordml" wp14:textId="4DA53019">
+      <w:pPr>
+        <w:keepNext w:val="1"/>
         <w:spacing w:after="80" w:line="259" w:lineRule="auto"/>
       </w:pPr>
       <w:r>
         <w:rPr>
           <w:rFonts w:ascii="Aptos" w:hAnsi="Aptos"/>
-          <w:b/>
+          <w:b w:val="1"/>
+          <w:bCs w:val="1"/>
           <w:color w:val="2F75B5"/>
           <w:sz w:val="20"/>
+          <w:szCs w:val="20"/>
         </w:rPr>
         <w:t xml:space="preserve">Description: </w:t>
       </w:r>
@@ -7878,10 +8010,78 @@
         <w:rPr>
           <w:rFonts w:ascii="Aptos" w:hAnsi="Aptos"/>
           <w:b w:val="0"/>
+          <w:bCs w:val="0"/>
           <w:color w:val="1F1F1F"/>
           <w:sz w:val="20"/>
-        </w:rPr>
-        <w:t>The Deposit field doesnot accepts decimal amounts , not allowing the user to perform transcation in decimals</w:t>
+          <w:szCs w:val="20"/>
+        </w:rPr>
+        <w:t xml:space="preserve">The Deposit field </w:t>
+      </w:r>
+      <w:r>
+        <w:rPr>
+          <w:rFonts w:ascii="Aptos" w:hAnsi="Aptos"/>
+          <w:b w:val="0"/>
+          <w:bCs w:val="0"/>
+          <w:color w:val="1F1F1F"/>
+          <w:sz w:val="20"/>
+          <w:szCs w:val="20"/>
+        </w:rPr>
+        <w:t>does not</w:t>
+      </w:r>
+      <w:r>
+        <w:rPr>
+          <w:rFonts w:ascii="Aptos" w:hAnsi="Aptos"/>
+          <w:b w:val="0"/>
+          <w:bCs w:val="0"/>
+          <w:color w:val="1F1F1F"/>
+          <w:sz w:val="20"/>
+          <w:szCs w:val="20"/>
+        </w:rPr>
+        <w:t xml:space="preserve"> accepts decimal </w:t>
+      </w:r>
+      <w:r>
+        <w:rPr>
+          <w:rFonts w:ascii="Aptos" w:hAnsi="Aptos"/>
+          <w:b w:val="0"/>
+          <w:bCs w:val="0"/>
+          <w:color w:val="1F1F1F"/>
+          <w:sz w:val="20"/>
+          <w:szCs w:val="20"/>
+        </w:rPr>
+        <w:t>amounts ,</w:t>
+      </w:r>
+      <w:r>
+        <w:rPr>
+          <w:rFonts w:ascii="Aptos" w:hAnsi="Aptos"/>
+          <w:b w:val="0"/>
+          <w:bCs w:val="0"/>
+          <w:color w:val="1F1F1F"/>
+          <w:sz w:val="20"/>
+          <w:szCs w:val="20"/>
+        </w:rPr>
+        <w:t xml:space="preserve"> not allowing the user to perform </w:t>
+      </w:r>
+      <w:r>
+        <w:rPr>
+          <w:rFonts w:ascii="Aptos" w:hAnsi="Aptos"/>
+          <w:b w:val="0"/>
+          <w:bCs w:val="0"/>
+          <w:color w:val="1F1F1F"/>
+          <w:sz w:val="20"/>
+          <w:szCs w:val="20"/>
+        </w:rPr>
+        <w:t>transaction</w:t>
+      </w:r>
+      <w:r>
+        <w:rPr>
+          <w:rFonts w:ascii="Aptos" w:hAnsi="Aptos"/>
+          <w:b w:val="0"/>
+          <w:bCs w:val="0"/>
+          <w:color w:val="1F1F1F"/>
+          <w:sz w:val="20"/>
+          <w:szCs w:val="20"/>
+        </w:rPr>
+        <w:t xml:space="preserve"> in decimals</w:t>
       </w:r>
     </w:p>
     <w:p xmlns:wp14="http://schemas.microsoft.com/office/word/2010/wordml" wp14:textId="77777777">
@@ -7963,24 +8163,67 @@
         <w:t>Open the Deposit tab.</w:t>
       </w:r>
     </w:p>
-    <w:p xmlns:wp14="http://schemas.microsoft.com/office/word/2010/wordml" wp14:textId="77777777">
+    <w:p xmlns:wp14="http://schemas.microsoft.com/office/word/2010/wordml" wp14:textId="3AD990D0">
       <w:pPr>
         <w:pStyle w:val="ListNumber"/>
-        <w:numPr>
-          <w:ilvl w:val="0"/>
-          <w:numId w:val="23"/>
-        </w:numPr>
         <w:spacing w:after="40" w:line="252" w:lineRule="auto"/>
         <w:ind w:left="403" w:hanging="259"/>
+        <w:rPr/>
       </w:pPr>
       <w:r>
         <w:rPr>
           <w:rFonts w:ascii="Aptos" w:hAnsi="Aptos"/>
           <w:b w:val="0"/>
+          <w:bCs w:val="0"/>
           <w:color w:val="1F1F1F"/>
           <w:sz w:val="20"/>
-        </w:rPr>
-        <w:t>Enter a decimal amount with more than two decimal places, such as 10.999.</w:t>
+          <w:szCs w:val="20"/>
+        </w:rPr>
+        <w:t xml:space="preserve">Enter a decimal amount with more than two decimal places, such as </w:t>
+      </w:r>
+      <w:r>
+        <w:rPr>
+          <w:rFonts w:ascii="Aptos" w:hAnsi="Aptos"/>
+          <w:b w:val="0"/>
+          <w:bCs w:val="0"/>
+          <w:color w:val="1F1F1F"/>
+          <w:sz w:val="20"/>
+          <w:szCs w:val="20"/>
+        </w:rPr>
+        <w:t>2</w:t>
+      </w:r>
+      <w:r>
+        <w:rPr>
+          <w:rFonts w:ascii="Aptos" w:hAnsi="Aptos"/>
+          <w:b w:val="0"/>
+          <w:bCs w:val="0"/>
+          <w:color w:val="1F1F1F"/>
+          <w:sz w:val="20"/>
+          <w:szCs w:val="20"/>
+        </w:rPr>
+        <w:t>.9</w:t>
+      </w:r>
+      <w:r>
+        <w:rPr>
+          <w:rFonts w:ascii="Aptos" w:hAnsi="Aptos"/>
+          <w:b w:val="0"/>
+          <w:bCs w:val="0"/>
+          <w:color w:val="1F1F1F"/>
+          <w:sz w:val="20"/>
+          <w:szCs w:val="20"/>
+        </w:rPr>
+        <w:t>8</w:t>
+      </w:r>
+      <w:r>
+        <w:rPr>
+          <w:rFonts w:ascii="Aptos" w:hAnsi="Aptos"/>
+          <w:b w:val="0"/>
+          <w:bCs w:val="0"/>
+          <w:color w:val="1F1F1F"/>
+          <w:sz w:val="20"/>
+          <w:szCs w:val="20"/>
+        </w:rPr>
+        <w:t>.</w:t>
       </w:r>
     </w:p>
     <w:p xmlns:wp14="http://schemas.microsoft.com/office/word/2010/wordml" wp14:textId="77777777">
@@ -8287,17 +8530,28 @@
         <w:t>The Deposit field does not apply a visible maximum transaction limit and accepts unrealistically large values. The application should enforce configured monetary and risk-control limits.</w:t>
       </w:r>
     </w:p>
-    <w:p xmlns:wp14="http://schemas.microsoft.com/office/word/2010/wordml" wp14:textId="77777777">
-      <w:pPr>
+    <w:p xmlns:wp14="http://schemas.microsoft.com/office/word/2010/wordml" wp14:textId="3C50F734">
+      <w:pPr>
+        <w:pStyle w:val="Normal"/>
         <w:keepNext w:val="0"/>
         <w:spacing w:after="80" w:line="259" w:lineRule="auto"/>
-      </w:pPr>
-      <w:r>
-        <w:rPr>
-          <w:rFonts w:ascii="Aptos" w:hAnsi="Aptos"/>
-          <w:b/>
+        <w:rPr>
+          <w:rFonts w:ascii="Aptos" w:hAnsi="Aptos"/>
+          <w:b w:val="1"/>
+          <w:bCs w:val="1"/>
           <w:color w:val="C65911"/>
           <w:sz w:val="20"/>
+          <w:szCs w:val="20"/>
+        </w:rPr>
+      </w:pPr>
+      <w:r>
+        <w:rPr>
+          <w:rFonts w:ascii="Aptos" w:hAnsi="Aptos"/>
+          <w:b w:val="1"/>
+          <w:bCs w:val="1"/>
+          <w:color w:val="C65911"/>
+          <w:sz w:val="20"/>
+          <w:szCs w:val="20"/>
         </w:rPr>
         <w:t xml:space="preserve">Business impact: </w:t>
       </w:r>
@@ -8305,10 +8559,38 @@
         <w:rPr>
           <w:rFonts w:ascii="Aptos" w:hAnsi="Aptos"/>
           <w:b w:val="0"/>
+          <w:bCs w:val="0"/>
           <w:color w:val="1F1F1F"/>
           <w:sz w:val="20"/>
+          <w:szCs w:val="20"/>
         </w:rPr>
         <w:t>Without configured transaction limits, unrealistic amounts may bypass operational, fraud, or risk controls and distort account balances.</w:t>
+      </w:r>
+      <w:r>
+        <w:rPr>
+          <w:rFonts w:ascii="Aptos" w:hAnsi="Aptos"/>
+          <w:b w:val="0"/>
+          <w:bCs w:val="0"/>
+          <w:color w:val="1F1F1F"/>
+          <w:sz w:val="20"/>
+          <w:szCs w:val="20"/>
+        </w:rPr>
+        <w:t xml:space="preserve"> </w:t>
+      </w:r>
+      <w:r>
+        <w:rPr>
+          <w:rFonts w:ascii="Aptos" w:hAnsi="Aptos" w:eastAsia="ＭＳ 明朝" w:cs="" w:asciiTheme="minorAscii" w:hAnsiTheme="minorAscii" w:eastAsiaTheme="minorEastAsia" w:cstheme="minorBidi"/>
+          <w:b w:val="1"/>
+          <w:bCs w:val="1"/>
+          <w:i w:val="1"/>
+          <w:iCs w:val="1"/>
+          <w:color w:val="C65911"/>
+          <w:sz w:val="20"/>
+          <w:szCs w:val="20"/>
+          <w:u w:val="single"/>
+          <w:lang w:eastAsia="en-US" w:bidi="ar-SA"/>
+        </w:rPr>
+        <w:t>Business rules pending</w:t>
       </w:r>
     </w:p>
     <w:p xmlns:wp14="http://schemas.microsoft.com/office/word/2010/wordml" wp14:textId="77777777">
@@ -10518,9 +10800,6 @@
         <w:pStyle w:val="ListNumber"/>
         <w:spacing w:after="40" w:line="252" w:lineRule="auto"/>
         <w:ind w:left="403" w:hanging="259"/>
-        <w:rPr/>
-      </w:pPr>
-      <w:r>
         <w:rPr>
           <w:rFonts w:ascii="Aptos" w:hAnsi="Aptos"/>
           <w:b w:val="0"/>
@@ -10529,8 +10808,7 @@
           <w:sz w:val="20"/>
           <w:szCs w:val="20"/>
         </w:rPr>
-        <w:t>Observe</w:t>
-      </w:r>
+      </w:pPr>
       <w:r>
         <w:rPr>
           <w:rFonts w:ascii="Aptos" w:hAnsi="Aptos"/>
@@ -10540,7 +10818,7 @@
           <w:sz w:val="20"/>
           <w:szCs w:val="20"/>
         </w:rPr>
-        <w:t xml:space="preserve"> the</w:t>
+        <w:t>Observe</w:t>
       </w:r>
       <w:r>
         <w:rPr>
@@ -10551,7 +10829,7 @@
           <w:sz w:val="20"/>
           <w:szCs w:val="20"/>
         </w:rPr>
-        <w:t xml:space="preserve"> success message after performing the transaction</w:t>
+        <w:t xml:space="preserve"> the</w:t>
       </w:r>
       <w:r>
         <w:rPr>
@@ -10562,7 +10840,68 @@
           <w:sz w:val="20"/>
           <w:szCs w:val="20"/>
         </w:rPr>
+        <w:t xml:space="preserve"> success message after performing the transaction</w:t>
+      </w:r>
+      <w:r>
+        <w:rPr>
+          <w:rFonts w:ascii="Aptos" w:hAnsi="Aptos"/>
+          <w:b w:val="0"/>
+          <w:bCs w:val="0"/>
+          <w:color w:val="1F1F1F"/>
+          <w:sz w:val="20"/>
+          <w:szCs w:val="20"/>
+        </w:rPr>
         <w:t>.</w:t>
+      </w:r>
+    </w:p>
+    <w:p>
+      <w:pPr>
+        <w:pStyle w:val="ListNumber"/>
+        <w:spacing w:after="40" w:line="252" w:lineRule="auto"/>
+        <w:rPr/>
+      </w:pPr>
+      <w:r>
+        <w:drawing>
+          <wp:inline wp14:editId="270E7851" wp14:anchorId="4ED2AE93">
+            <wp:extent cx="5943600" cy="3371850"/>
+            <wp:effectExtent l="0" t="0" r="0" b="0"/>
+            <wp:docPr id="494146167" name="drawing"/>
+            <wp:cNvGraphicFramePr>
+              <a:graphicFrameLocks noChangeAspect="1"/>
+            </wp:cNvGraphicFramePr>
+            <a:graphic>
+              <a:graphicData xmlns:a="http://schemas.openxmlformats.org/drawingml/2006/main" uri="http://schemas.openxmlformats.org/drawingml/2006/picture">
+                <pic:pic xmlns:pic="http://schemas.openxmlformats.org/drawingml/2006/picture">
+                  <pic:nvPicPr>
+                    <pic:cNvPr id="494146167" name="Picture 494146167"/>
+                    <pic:cNvPicPr/>
+                  </pic:nvPicPr>
+                  <pic:blipFill>
+                    <a:blip xmlns:r="http://schemas.openxmlformats.org/officeDocument/2006/relationships" r:embed="rId1099301317">
+                      <a:extLst>
+                        <a:ext uri="{28A0092B-C50C-407E-A947-70E740481C1C}">
+                          <a14:useLocalDpi xmlns:a14="http://schemas.microsoft.com/office/drawing/2010/main"/>
+                        </a:ext>
+                      </a:extLst>
+                    </a:blip>
+                    <a:stretch>
+                      <a:fillRect/>
+                    </a:stretch>
+                  </pic:blipFill>
+                  <pic:spPr>
+                    <a:xfrm>
+                      <a:off x="0" y="0"/>
+                      <a:ext cx="5943600" cy="3371850"/>
+                    </a:xfrm>
+                    <a:prstGeom prst="rect">
+                      <a:avLst/>
+                    </a:prstGeom>
+                  </pic:spPr>
+                </pic:pic>
+              </a:graphicData>
+            </a:graphic>
+          </wp:inline>
+        </w:drawing>
       </w:r>
     </w:p>
     <w:p xmlns:wp14="http://schemas.microsoft.com/office/word/2010/wordml" wp14:textId="77777777">

</xml_diff>